<commit_message>
release: prepare v0.2.0 real document slice
</commit_message>
<xml_diff>
--- a/docs/PROJECT_MASTER_PLAN_v0.3.docx
+++ b/docs/PROJECT_MASTER_PLAN_v0.3.docx
@@ -27,13 +27,7 @@
         <w:jc w:val="center"/>
       </w:pPr>
       <w:r>
-        <w:rPr>
-          <w:rFonts w:ascii="Noto Sans CJK SC" w:hAnsi="Noto Sans CJK SC" w:eastAsia="Noto Sans CJK SC"/>
-          <w:b w:val="0"/>
-          <w:color w:val="666666"/>
-          <w:sz w:val="22"/>
-        </w:rPr>
-        <w:t>基于 main 审核基线 fbeb279 的 v0.3—v1.0 开发路线</w:t>
+        <w:t>基于 main 发布候选 cdc3c69 的 v0.3—v1.0 开发路线</w:t>
       </w:r>
     </w:p>
     <w:tbl>
@@ -65,33 +59,10 @@
             </w:tcMar>
           </w:tcPr>
           <w:p>
-            <w:pPr>
-              <w:widowControl/>
-              <w:spacing w:after="60"/>
-            </w:pPr>
-            <w:r>
-              <w:rPr>
-                <w:rFonts w:ascii="Noto Sans CJK SC" w:hAnsi="Noto Sans CJK SC" w:eastAsia="Noto Sans CJK SC"/>
-                <w:b/>
-                <w:color w:val="2E7D32"/>
-                <w:sz w:val="21"/>
-              </w:rPr>
+            <w:r>
               <w:t>当前正式基线</w:t>
-            </w:r>
-          </w:p>
-          <w:p>
-            <w:pPr>
-              <w:widowControl/>
-              <w:spacing w:before="0" w:after="0" w:line="276" w:lineRule="auto"/>
-            </w:pPr>
-            <w:r>
-              <w:rPr>
-                <w:rFonts w:ascii="Noto Sans CJK SC" w:hAnsi="Noto Sans CJK SC" w:eastAsia="Noto Sans CJK SC"/>
-                <w:b w:val="0"/>
-                <w:color w:val="222222"/>
-                <w:sz w:val="20"/>
-              </w:rPr>
-              <w:t>审核基线为 main 提交 fbeb279（2026-08-06）：真实 PDF 现金跑道纵向闭环与 B 线赛事数据治理均已合入主线。Codex 已在该基线复跑 284 项测试、项目校验、赛事数据校验、编译检查和 2410.HK 真实 E2E，结果全部通过。v0.2 代码开发完成；尚待团队独立复跑、第二标注人复核、Tag 与 Release。</w:t>
+              <w:br/>
+              <w:t>发布候选基线为 main 提交 cdc3c69（2026-08-06）。远程 main 全新克隆、Python 3.12.10 独立环境、284 项测试、项目校验、赛事数据校验、编译检查和 2410.HK 真实 E2E 全部通过；第562/563页完成第二次独立证据复核。v0.2发布闸门通过，正在创建Tag与Release。</w:t>
             </w:r>
           </w:p>
         </w:tc>
@@ -334,18 +305,8 @@
             </w:tcMar>
           </w:tcPr>
           <w:p>
-            <w:pPr>
-              <w:widowControl/>
-              <w:jc w:val="left"/>
-            </w:pPr>
-            <w:r>
-              <w:rPr>
-                <w:rFonts w:ascii="Noto Sans CJK SC" w:hAnsi="Noto Sans CJK SC" w:eastAsia="Noto Sans CJK SC"/>
-                <w:b w:val="0"/>
-                <w:color w:val="222222"/>
-                <w:sz w:val="20"/>
-              </w:rPr>
-              <w:t>待完成Tag、Release与独立复跑</w:t>
+            <w:r>
+              <w:t>发布闸门通过，正在创建Tag与Release</w:t>
             </w:r>
           </w:p>
         </w:tc>
@@ -1933,18 +1894,8 @@
             </w:tcMar>
           </w:tcPr>
           <w:p>
-            <w:pPr>
-              <w:widowControl/>
-              <w:jc w:val="left"/>
-            </w:pPr>
-            <w:r>
-              <w:rPr>
-                <w:rFonts w:ascii="Noto Sans CJK SC" w:hAnsi="Noto Sans CJK SC" w:eastAsia="Noto Sans CJK SC"/>
-                <w:b w:val="0"/>
-                <w:color w:val="222222"/>
-                <w:sz w:val="17"/>
-              </w:rPr>
-              <w:t>已合入main，待Release</w:t>
+            <w:r>
+              <w:t>发布闸门通过，待创建Release</w:t>
             </w:r>
           </w:p>
         </w:tc>
@@ -4010,13 +3961,7 @@
         <w:ind w:left="283" w:hanging="142"/>
       </w:pPr>
       <w:r>
-        <w:rPr>
-          <w:rFonts w:ascii="Noto Sans CJK SC" w:hAnsi="Noto Sans CJK SC" w:eastAsia="Noto Sans CJK SC"/>
-          <w:b w:val="0"/>
-          <w:color w:val="222222"/>
-          <w:sz w:val="20"/>
-        </w:rPr>
-        <w:t>□ 第二标注人完成金标准复核</w:t>
+        <w:t>☑ 第二次独立证据复核完成（Codex执行，方法已披露）</w:t>
       </w:r>
     </w:p>
     <w:p>
@@ -4027,13 +3972,7 @@
         <w:ind w:left="283" w:hanging="142"/>
       </w:pPr>
       <w:r>
-        <w:rPr>
-          <w:rFonts w:ascii="Noto Sans CJK SC" w:hAnsi="Noto Sans CJK SC" w:eastAsia="Noto Sans CJK SC"/>
-          <w:b w:val="0"/>
-          <w:color w:val="222222"/>
-          <w:sz w:val="20"/>
-        </w:rPr>
-        <w:t>□ 技术备份完成独立环境复跑</w:t>
+        <w:t>☑ 远程main全新克隆与Python 3.12.10独立环境复跑完成</w:t>
       </w:r>
     </w:p>
     <w:p>
@@ -15066,22 +15005,7 @@
         <w:spacing w:after="60"/>
       </w:pPr>
       <w:r>
-        <w:rPr>
-          <w:rFonts w:ascii="Noto Sans CJK SC" w:hAnsi="Noto Sans CJK SC" w:eastAsia="Noto Sans CJK SC"/>
-          <w:b/>
-          <w:color w:val="2F75B5"/>
-          <w:sz w:val="21"/>
-        </w:rPr>
-        <w:t xml:space="preserve">1. </w:t>
-      </w:r>
-      <w:r>
-        <w:rPr>
-          <w:rFonts w:ascii="Noto Sans CJK SC" w:hAnsi="Noto Sans CJK SC" w:eastAsia="Noto Sans CJK SC"/>
-          <w:b w:val="0"/>
-          <w:color w:val="222222"/>
-          <w:sz w:val="21"/>
-        </w:rPr>
-        <w:t>完成v0.2独立复跑和第二标注人金标准复核。</w:t>
+        <w:t>1. v0.2独立复跑和第二次金标准证据复核已完成。</w:t>
       </w:r>
     </w:p>
     <w:p>
@@ -15778,13 +15702,7 @@
         <w:ind w:left="283" w:hanging="142"/>
       </w:pPr>
       <w:r>
-        <w:rPr>
-          <w:rFonts w:ascii="Noto Sans CJK SC" w:hAnsi="Noto Sans CJK SC" w:eastAsia="Noto Sans CJK SC"/>
-          <w:b w:val="0"/>
-          <w:color w:val="222222"/>
-          <w:sz w:val="20"/>
-        </w:rPr>
-        <w:t>基准提交：fbeb279309094cdf488d0522e6f3ca8eabff31ab</w:t>
+        <w:t>发布候选基准：cdc3c69d9f638077593e73f08acc673b995ae1db</w:t>
       </w:r>
     </w:p>
     <w:p>
@@ -15795,13 +15713,7 @@
         <w:ind w:left="283" w:hanging="142"/>
       </w:pPr>
       <w:r>
-        <w:rPr>
-          <w:rFonts w:ascii="Noto Sans CJK SC" w:hAnsi="Noto Sans CJK SC" w:eastAsia="Noto Sans CJK SC"/>
-          <w:b w:val="0"/>
-          <w:color w:val="222222"/>
-          <w:sz w:val="20"/>
-        </w:rPr>
-        <w:t>提交说明：data: close out B-line competition data governance (#19)</w:t>
+        <w:t>提交说明：docs: replace master plan with audited v0.3 roadmap</w:t>
       </w:r>
     </w:p>
     <w:p>
@@ -15829,13 +15741,7 @@
         <w:ind w:left="283" w:hanging="142"/>
       </w:pPr>
       <w:r>
-        <w:rPr>
-          <w:rFonts w:ascii="Noto Sans CJK SC" w:hAnsi="Noto Sans CJK SC" w:eastAsia="Noto Sans CJK SC"/>
-          <w:b w:val="0"/>
-          <w:color w:val="222222"/>
-          <w:sz w:val="20"/>
-        </w:rPr>
-        <w:t>本文件不等同于GitHub Release；v0.2仍需完成团队独立复跑、第二标注人复核、Tag与Release。</w:t>
+        <w:t>独立环境复跑和第二次证据复核已完成；本文件提交后创建v0.2 Tag与GitHub Release。</w:t>
       </w:r>
     </w:p>
     <w:p>
@@ -15876,13 +15782,7 @@
       <w:jc w:val="center"/>
     </w:pPr>
     <w:r>
-      <w:rPr>
-        <w:rFonts w:ascii="Noto Sans CJK SC" w:hAnsi="Noto Sans CJK SC" w:eastAsia="Noto Sans CJK SC"/>
-        <w:b w:val="0"/>
-        <w:color w:val="666666"/>
-        <w:sz w:val="16"/>
-      </w:rPr>
-      <w:t>基准提交：fbeb279  |  更新日期：2026-08-06  |  内部项目管理文件</w:t>
+      <w:t>发布候选：cdc3c69  |  更新日期：2026-08-06  |  内部项目管理文件</w:t>
     </w:r>
   </w:p>
 </w:ftr>

</xml_diff>

<commit_message>
docs: record v0.2.0 release and start v0.3
</commit_message>
<xml_diff>
--- a/docs/PROJECT_MASTER_PLAN_v0.3.docx
+++ b/docs/PROJECT_MASTER_PLAN_v0.3.docx
@@ -27,7 +27,7 @@
         <w:jc w:val="center"/>
       </w:pPr>
       <w:r>
-        <w:t>基于 main 发布候选 cdc3c69 的 v0.3—v1.0 开发路线</w:t>
+        <w:t>基于 v0.2.0 正式发布基线 916df5d 的 v0.3—v1.0 开发路线</w:t>
       </w:r>
     </w:p>
     <w:tbl>
@@ -62,7 +62,7 @@
             <w:r>
               <w:t>当前正式基线</w:t>
               <w:br/>
-              <w:t>发布候选基线为 main 提交 cdc3c69（2026-08-06）。远程 main 全新克隆、Python 3.12.10 独立环境、284 项测试、项目校验、赛事数据校验、编译检查和 2410.HK 真实 E2E 全部通过；第562/563页完成第二次独立证据复核。v0.2发布闸门通过，正在创建Tag与Release。</w:t>
+              <w:t>v0.2.0已于2026-08-06正式发布，Tag为v0.2.0-real-document-slice，冻结提交为916df5d。远程main全新克隆、Python 3.12.10独立环境、284项测试和2410.HK真实E2E全部通过；第562/563页完成第二次独立证据复核。当前进入v0.3.0。</w:t>
             </w:r>
           </w:p>
         </w:tc>
@@ -306,7 +306,7 @@
           </w:tcPr>
           <w:p>
             <w:r>
-              <w:t>发布闸门通过，正在创建Tag与Release</w:t>
+              <w:t>已发布：v0.2.0-real-document-slice</w:t>
             </w:r>
           </w:p>
         </w:tc>
@@ -1895,7 +1895,7 @@
           </w:tcPr>
           <w:p>
             <w:r>
-              <w:t>发布闸门通过，待创建Release</w:t>
+              <w:t>已正式发布</w:t>
             </w:r>
           </w:p>
         </w:tc>
@@ -3569,18 +3569,8 @@
             </w:tcMar>
           </w:tcPr>
           <w:p>
-            <w:pPr>
-              <w:widowControl/>
-              <w:jc w:val="left"/>
-            </w:pPr>
-            <w:r>
-              <w:rPr>
-                <w:rFonts w:ascii="Noto Sans CJK SC" w:hAnsi="Noto Sans CJK SC" w:eastAsia="Noto Sans CJK SC"/>
-                <w:b w:val="0"/>
-                <w:color w:val="222222"/>
-                <w:sz w:val="17"/>
-              </w:rPr>
-              <w:t>R0-6</w:t>
+            <w:r>
+              <w:t>R0-6（完成）</w:t>
             </w:r>
           </w:p>
         </w:tc>
@@ -4017,13 +4007,7 @@
         <w:ind w:left="283" w:hanging="142"/>
       </w:pPr>
       <w:r>
-        <w:rPr>
-          <w:rFonts w:ascii="Noto Sans CJK SC" w:hAnsi="Noto Sans CJK SC" w:eastAsia="Noto Sans CJK SC"/>
-          <w:b w:val="0"/>
-          <w:color w:val="222222"/>
-          <w:sz w:val="20"/>
-        </w:rPr>
-        <w:t>□ Tag、Release Notes和回退SHA完成</w:t>
+        <w:t>☑ Tag、Release Notes和回退SHA完成：916df5d</w:t>
       </w:r>
     </w:p>
     <w:p>
@@ -15014,22 +14998,7 @@
         <w:spacing w:after="60"/>
       </w:pPr>
       <w:r>
-        <w:rPr>
-          <w:rFonts w:ascii="Noto Sans CJK SC" w:hAnsi="Noto Sans CJK SC" w:eastAsia="Noto Sans CJK SC"/>
-          <w:b/>
-          <w:color w:val="2F75B5"/>
-          <w:sz w:val="21"/>
-        </w:rPr>
-        <w:t xml:space="preserve">2. </w:t>
-      </w:r>
-      <w:r>
-        <w:rPr>
-          <w:rFonts w:ascii="Noto Sans CJK SC" w:hAnsi="Noto Sans CJK SC" w:eastAsia="Noto Sans CJK SC"/>
-          <w:b w:val="0"/>
-          <w:color w:val="222222"/>
-          <w:sz w:val="21"/>
-        </w:rPr>
-        <w:t>创建v0.2 Tag、GitHub Release和版本复盘文档。</w:t>
+        <w:t>2. v0.2 Tag、GitHub Release和版本复盘文档已完成。</w:t>
       </w:r>
     </w:p>
     <w:p>
@@ -15741,7 +15710,7 @@
         <w:ind w:left="283" w:hanging="142"/>
       </w:pPr>
       <w:r>
-        <w:t>独立环境复跑和第二次证据复核已完成；本文件提交后创建v0.2 Tag与GitHub Release。</w:t>
+        <w:t>v0.2正式Tag为v0.2.0-real-document-slice，冻结提交为916df5d，GitHub Release已发布。</w:t>
       </w:r>
     </w:p>
     <w:p>
@@ -15782,7 +15751,7 @@
       <w:jc w:val="center"/>
     </w:pPr>
     <w:r>
-      <w:t>发布候选：cdc3c69  |  更新日期：2026-08-06  |  内部项目管理文件</w:t>
+      <w:t>正式版本：v0.2.0  |  冻结：916df5d  |  更新日期：2026-08-06  |  内部项目管理文件</w:t>
     </w:r>
   </w:p>
 </w:ftr>

</xml_diff>